<commit_message>
User manual explains the two loss metrics
New 'Loss Ratio vs Impaired Invested Capital' section in the What-you-
get chapter: shared below-1.0x test, what each one counts (shortfall
vs full cost basis), a two-deal worked example (100% vs 51%), and how
to read the pair together (close = write-off failures; far apart =
shallow marks that may recover; their ratio = average depth of loss).
The Return & Loss Ratios intro sentence now names both metrics.
Edited in place on the committed docx (Word-normalised XML), validated,
rest of the document untouched.

Co-Authored-By: Claude Fable 5 <noreply@anthropic.com>
</commit_message>
<xml_diff>
--- a/TR-Analyzer User Manual.docx
+++ b/TR-Analyzer User Manual.docx
@@ -56,15 +56,7 @@
         <w:spacing w:after="120"/>
       </w:pPr>
       <w:r>
-        <w:t xml:space="preserve">Every GP submits its track record in a different Excel format — different column names, layouts, units, footnotes. The analysis we want at the end is always the same: the standardized 7-tab Segmented Track Record Analysis workbook. This tool automates everything in between, so the hours you would spend re-keying and reconciling a GP's spreadsheet go into </w:t>
-      </w:r>
-      <w:proofErr w:type="gramStart"/>
-      <w:r>
-        <w:t>actually evaluating</w:t>
-      </w:r>
-      <w:proofErr w:type="gramEnd"/>
-      <w:r>
-        <w:t xml:space="preserve"> the manager.</w:t>
+        <w:t xml:space="preserve">Every GP submits its track record in a different Excel format — different column names, layouts, units, footnotes. The analysis we want at the end is always the same: the standardized 7-tab Segmented Track Record Analysis workbook. This tool automates everything in between, so the hours you would spend re-keying and reconciling a GP's spreadsheet go into actually evaluating the manager.</w:t>
       </w:r>
     </w:p>
     <w:p>
@@ -170,7 +162,6 @@
       <w:r>
         <w:t xml:space="preserve">Open the team's private GitHub repository and switch the branch selector (top-left) to </w:t>
       </w:r>
-      <w:proofErr w:type="spellStart"/>
       <w:r>
         <w:rPr>
           <w:b/>
@@ -178,7 +169,6 @@
         </w:rPr>
         <w:t>vba</w:t>
       </w:r>
-      <w:proofErr w:type="spellEnd"/>
       <w:r>
         <w:t>.</w:t>
       </w:r>
@@ -243,15 +233,7 @@
         <w:spacing w:after="80"/>
       </w:pPr>
       <w:r>
-        <w:t xml:space="preserve">Windows only, before </w:t>
-      </w:r>
-      <w:proofErr w:type="gramStart"/>
-      <w:r>
-        <w:t>extracting:</w:t>
-      </w:r>
-      <w:proofErr w:type="gramEnd"/>
-      <w:r>
-        <w:t xml:space="preserve"> right-click the downloaded ZIP → </w:t>
+        <w:t xml:space="preserve">Windows only, before extracting: right-click the downloaded ZIP → </w:t>
       </w:r>
       <w:r>
         <w:rPr>
@@ -362,7 +344,6 @@
               </w:rPr>
               <w:t xml:space="preserve"> / </w:t>
             </w:r>
-            <w:proofErr w:type="spellStart"/>
             <w:r>
               <w:rPr>
                 <w:rFonts w:ascii="Courier New" w:eastAsia="Courier New" w:hAnsi="Courier New" w:cs="Courier New"/>
@@ -371,7 +352,6 @@
               </w:rPr>
               <w:t>start.command</w:t>
             </w:r>
-            <w:proofErr w:type="spellEnd"/>
             <w:r>
               <w:rPr>
                 <w:sz w:val="20"/>
@@ -384,23 +364,13 @@
             <w:pPr>
               <w:spacing w:after="40"/>
             </w:pPr>
-            <w:proofErr w:type="spellStart"/>
             <w:r>
               <w:rPr>
                 <w:rFonts w:ascii="Courier New" w:eastAsia="Courier New" w:hAnsi="Courier New" w:cs="Courier New"/>
                 <w:sz w:val="19"/>
                 <w:szCs w:val="19"/>
               </w:rPr>
-              <w:t>vba</w:t>
-            </w:r>
-            <w:proofErr w:type="spellEnd"/>
-            <w:r>
-              <w:rPr>
-                <w:rFonts w:ascii="Courier New" w:eastAsia="Courier New" w:hAnsi="Courier New" w:cs="Courier New"/>
-                <w:sz w:val="19"/>
-                <w:szCs w:val="19"/>
-              </w:rPr>
-              <w:t>/TR-Analyzer.xlsm</w:t>
+              <w:t>vba/TR-Analyzer.xlsm</w:t>
             </w:r>
             <w:r>
               <w:rPr>
@@ -513,7 +483,6 @@
       <w:r>
         <w:t xml:space="preserve"> on Windows, </w:t>
       </w:r>
-      <w:proofErr w:type="spellStart"/>
       <w:r>
         <w:rPr>
           <w:b/>
@@ -521,7 +490,6 @@
         </w:rPr>
         <w:t>start.command</w:t>
       </w:r>
-      <w:proofErr w:type="spellEnd"/>
       <w:r>
         <w:t xml:space="preserve"> on Mac.</w:t>
       </w:r>
@@ -694,15 +662,7 @@
         <w:spacing w:after="120"/>
       </w:pPr>
       <w:r>
-        <w:t xml:space="preserve">Drag the GP's Excel file into the upload box. The app scans the workbook immediately and shows what it found: the deal table it detected, the GP name (from the filename — correct it if wrong), and your name. </w:t>
-      </w:r>
-      <w:proofErr w:type="gramStart"/>
-      <w:r>
-        <w:t>Usually</w:t>
-      </w:r>
-      <w:proofErr w:type="gramEnd"/>
-      <w:r>
-        <w:t xml:space="preserve"> you touch nothing here. Click </w:t>
+        <w:t xml:space="preserve">Drag the GP's Excel file into the upload box. The app scans the workbook immediately and shows what it found: the deal table it detected, the GP name (from the filename — correct it if wrong), and your name. Usually you touch nothing here. Click </w:t>
       </w:r>
       <w:r>
         <w:rPr>
@@ -1099,21 +1059,12 @@
       <w:r>
         <w:t xml:space="preserve">Open </w:t>
       </w:r>
-      <w:proofErr w:type="spellStart"/>
       <w:r>
         <w:rPr>
           <w:b/>
           <w:bCs/>
         </w:rPr>
-        <w:t>vba</w:t>
-      </w:r>
-      <w:proofErr w:type="spellEnd"/>
-      <w:r>
-        <w:rPr>
-          <w:b/>
-          <w:bCs/>
-        </w:rPr>
-        <w:t>/TR-Analyzer.xlsm</w:t>
+        <w:t>vba/TR-Analyzer.xlsm</w:t>
       </w:r>
       <w:r>
         <w:t xml:space="preserve"> from the tool folder. When Excel asks, click </w:t>
@@ -1161,7 +1112,6 @@
       <w:r>
         <w:t xml:space="preserve"> (Mac), select </w:t>
       </w:r>
-      <w:proofErr w:type="spellStart"/>
       <w:r>
         <w:rPr>
           <w:b/>
@@ -1169,7 +1119,6 @@
         </w:rPr>
         <w:t>ImportInputsAndBuild</w:t>
       </w:r>
-      <w:proofErr w:type="spellEnd"/>
       <w:r>
         <w:t>, click Run.</w:t>
       </w:r>
@@ -1497,7 +1446,7 @@
         <w:t>Return &amp; Loss Ratios</w:t>
       </w:r>
       <w:r>
-        <w:t>, which pools MOIC and loss ratio across fifteen cuts:</w:t>
+        <w:t>, which pools MOIC, Loss Ratio and Impaired Invested Capital across fifteen cuts:</w:t>
       </w:r>
     </w:p>
     <w:p>
@@ -1562,6 +1511,89 @@
           <w:szCs w:val="18"/>
         </w:rPr>
         <w:t>Return &amp; Loss Ratios — one of fifteen cuts, each with its own chart.</w:t>
+      </w:r>
+    </w:p>
+    <w:p>
+      <w:pPr>
+        <w:pStyle w:val="Heading2"/>
+        <w:spacing w:after="120"/>
+      </w:pPr>
+      <w:r>
+        <w:t xml:space="preserve">Loss Ratio vs Impaired Invested Capital</w:t>
+      </w:r>
+    </w:p>
+    <w:p>
+      <w:pPr>
+        <w:spacing w:after="120"/>
+      </w:pPr>
+      <w:r>
+        <w:t xml:space="preserve">Both loss metrics appear side by side on every pivot. They share one test — a deal is </w:t>
+      </w:r>
+      <w:r>
+        <w:rPr>
+          <w:b/>
+          <w:bCs/>
+        </w:rPr>
+        <w:t xml:space="preserve">in loss position</w:t>
+      </w:r>
+      <w:r>
+        <w:t xml:space="preserve"> when its Gross MOIC is below 1.0x — but they count different things:</w:t>
+      </w:r>
+    </w:p>
+    <w:p>
+      <w:pPr>
+        <w:pStyle w:val="ListParagraph"/>
+        <w:numPr>
+          <w:ilvl w:val="0"/>
+          <w:numId w:val="2"/>
+        </w:numPr>
+        <w:spacing w:after="60"/>
+      </w:pPr>
+      <w:r>
+        <w:rPr>
+          <w:b/>
+          <w:bCs/>
+        </w:rPr>
+        <w:t xml:space="preserve">Impaired Invested Capital</w:t>
+      </w:r>
+      <w:r>
+        <w:t xml:space="preserve"> = invested capital of the below-1.0x deals ÷ total invested capital.  Breadth: how much capital is in trouble — the full cost of every underwater deal counts, however shallow the mark.</w:t>
+      </w:r>
+    </w:p>
+    <w:p>
+      <w:pPr>
+        <w:pStyle w:val="ListParagraph"/>
+        <w:numPr>
+          <w:ilvl w:val="0"/>
+          <w:numId w:val="2"/>
+        </w:numPr>
+        <w:spacing w:after="60"/>
+      </w:pPr>
+      <w:r>
+        <w:rPr>
+          <w:b/>
+          <w:bCs/>
+        </w:rPr>
+        <w:t xml:space="preserve">Loss Ratio</w:t>
+      </w:r>
+      <w:r>
+        <w:t xml:space="preserve"> = (invested capital − current total value) of those deals ÷ total invested capital.  Depth: how much capital is actually lost at current marks — only the shortfall counts.</w:t>
+      </w:r>
+    </w:p>
+    <w:p>
+      <w:pPr>
+        <w:spacing w:after="120"/>
+      </w:pPr>
+      <w:r>
+        <w:t xml:space="preserve">A quick example — two deals of 100 each: one marked at 98 (0.98x), one written off to 0.  Impaired Invested Capital = 200 / 200 = 100%.  Loss Ratio = (2 + 100) / 200 = 51%.</w:t>
+      </w:r>
+    </w:p>
+    <w:p>
+      <w:pPr>
+        <w:spacing w:after="120"/>
+      </w:pPr>
+      <w:r>
+        <w:t xml:space="preserve">Read them together. Loss Ratio can never exceed Impaired Invested Capital. When the two are close, the losing deals went to (near) zero — failures are write-offs. When Loss Ratio sits far below, most underwater capital is only slightly under cost — often younger deals that may still recover. Dividing one by the other gives the average depth of loss among the losing deals. And with the Status filter set to Realized, both become cash-only — the GP's own marks stripped out.</w:t>
       </w:r>
     </w:p>
     <w:p>
@@ -2112,23 +2144,7 @@
                 <w:sz w:val="20"/>
                 <w:szCs w:val="20"/>
               </w:rPr>
-              <w:t xml:space="preserve">That's normal for optional fields the GP doesn't report — they stay blank. Only fix mappings for data that is </w:t>
-            </w:r>
-            <w:proofErr w:type="gramStart"/>
-            <w:r>
-              <w:rPr>
-                <w:sz w:val="20"/>
-                <w:szCs w:val="20"/>
-              </w:rPr>
-              <w:t>actually in</w:t>
-            </w:r>
-            <w:proofErr w:type="gramEnd"/>
-            <w:r>
-              <w:rPr>
-                <w:sz w:val="20"/>
-                <w:szCs w:val="20"/>
-              </w:rPr>
-              <w:t xml:space="preserve"> the file.</w:t>
+              <w:t xml:space="preserve">That's normal for optional fields the GP doesn't report — they stay blank. Only fix mappings for data that is actually in the file.</w:t>
             </w:r>
           </w:p>
         </w:tc>
@@ -2206,23 +2222,7 @@
                 <w:sz w:val="22"/>
                 <w:szCs w:val="22"/>
               </w:rPr>
-              <w:t xml:space="preserve">Double-click start.bat / </w:t>
-            </w:r>
-            <w:proofErr w:type="spellStart"/>
-            <w:r>
-              <w:rPr>
-                <w:sz w:val="22"/>
-                <w:szCs w:val="22"/>
-              </w:rPr>
-              <w:t>start.command</w:t>
-            </w:r>
-            <w:proofErr w:type="spellEnd"/>
-            <w:r>
-              <w:rPr>
-                <w:sz w:val="22"/>
-                <w:szCs w:val="22"/>
-              </w:rPr>
-              <w:t xml:space="preserve"> — the app opens in your browser.</w:t>
+              <w:t xml:space="preserve">Double-click start.bat / start.command — the app opens in your browser.</w:t>
             </w:r>
           </w:p>
           <w:p>
@@ -2305,37 +2305,12 @@
               </w:rPr>
               <w:t xml:space="preserve">5   </w:t>
             </w:r>
-            <w:proofErr w:type="spellStart"/>
             <w:r>
               <w:rPr>
                 <w:sz w:val="22"/>
                 <w:szCs w:val="22"/>
               </w:rPr>
-              <w:t>vba</w:t>
-            </w:r>
-            <w:proofErr w:type="spellEnd"/>
-            <w:r>
-              <w:rPr>
-                <w:sz w:val="22"/>
-                <w:szCs w:val="22"/>
-              </w:rPr>
-              <w:t xml:space="preserve">/TR-Analyzer.xlsm → Enable Macros → Alt/Opt+F8 → </w:t>
-            </w:r>
-            <w:proofErr w:type="spellStart"/>
-            <w:r>
-              <w:rPr>
-                <w:sz w:val="22"/>
-                <w:szCs w:val="22"/>
-              </w:rPr>
-              <w:t>ImportInputsAndBuild</w:t>
-            </w:r>
-            <w:proofErr w:type="spellEnd"/>
-            <w:r>
-              <w:rPr>
-                <w:sz w:val="22"/>
-                <w:szCs w:val="22"/>
-              </w:rPr>
-              <w:t xml:space="preserve"> → pick the download → 7 tabs. Save As its own name.</w:t>
+              <w:t xml:space="preserve">vba/TR-Analyzer.xlsm → Enable Macros → Alt/Opt+F8 → ImportInputsAndBuild → pick the download → 7 tabs. Save As its own name.</w:t>
             </w:r>
           </w:p>
           <w:p>
@@ -2357,23 +2332,7 @@
                 <w:sz w:val="22"/>
                 <w:szCs w:val="22"/>
               </w:rPr>
-              <w:t xml:space="preserve">(After verifying) </w:t>
-            </w:r>
-            <w:proofErr w:type="gramStart"/>
-            <w:r>
-              <w:rPr>
-                <w:sz w:val="22"/>
-                <w:szCs w:val="22"/>
-              </w:rPr>
-              <w:t>sidebar</w:t>
-            </w:r>
-            <w:proofErr w:type="gramEnd"/>
-            <w:r>
-              <w:rPr>
-                <w:sz w:val="22"/>
-                <w:szCs w:val="22"/>
-              </w:rPr>
-              <w:t xml:space="preserve"> → Publish to database → upload the verified file → Publish.</w:t>
+              <w:t xml:space="preserve">(After verifying) sidebar → Publish to database → upload the verified file → Publish.</w:t>
             </w:r>
           </w:p>
         </w:tc>

</xml_diff>